<commit_message>
Clarify cantilever deformation with equal scales and tip detail
</commit_message>
<xml_diff>
--- a/public/learn/AgentFEM-first-simulations.docx
+++ b/public/learn/AgentFEM-first-simulations.docx
@@ -3162,7 +3162,7 @@
       <w:r>
         <w:drawing>
           <wp:inline xmlns:a="http://schemas.openxmlformats.org/drawingml/2006/main" xmlns:pic="http://schemas.openxmlformats.org/drawingml/2006/picture">
-            <wp:extent cx="4699000" cy="1342571"/>
+            <wp:extent cx="4699000" cy="1255578"/>
             <wp:docPr id="5" name="Picture 5" descr="beam 参考结果图"/>
             <wp:cNvGraphicFramePr>
               <a:graphicFrameLocks noChangeAspect="1"/>
@@ -3183,7 +3183,7 @@
                   <pic:spPr>
                     <a:xfrm>
                       <a:off x="0" y="0"/>
-                      <a:ext cx="4699000" cy="1342571"/>
+                      <a:ext cx="4699000" cy="1255578"/>
                     </a:xfrm>
                     <a:prstGeom prst="rect"/>
                   </pic:spPr>

</xml_diff>

<commit_message>
Clarify cantilever deformation with equal scales and tip detail (#9)
</commit_message>
<xml_diff>
--- a/public/learn/AgentFEM-first-simulations.docx
+++ b/public/learn/AgentFEM-first-simulations.docx
@@ -3162,7 +3162,7 @@
       <w:r>
         <w:drawing>
           <wp:inline xmlns:a="http://schemas.openxmlformats.org/drawingml/2006/main" xmlns:pic="http://schemas.openxmlformats.org/drawingml/2006/picture">
-            <wp:extent cx="4699000" cy="1342571"/>
+            <wp:extent cx="4699000" cy="1255578"/>
             <wp:docPr id="5" name="Picture 5" descr="beam 参考结果图"/>
             <wp:cNvGraphicFramePr>
               <a:graphicFrameLocks noChangeAspect="1"/>
@@ -3183,7 +3183,7 @@
                   <pic:spPr>
                     <a:xfrm>
                       <a:off x="0" y="0"/>
-                      <a:ext cx="4699000" cy="1342571"/>
+                      <a:ext cx="4699000" cy="1255578"/>
                     </a:xfrm>
                     <a:prstGeom prst="rect"/>
                   </pic:spPr>

</xml_diff>

<commit_message>
Add teacher acknowledgment and editable footer placeholder
</commit_message>
<xml_diff>
--- a/public/learn/AgentFEM-first-simulations.docx
+++ b/public/learn/AgentFEM-first-simulations.docx
@@ -719,6 +719,21 @@
           <w:sz w:val="17"/>
         </w:rPr>
         <w:t>。Windows 使用 WSL2。</w:t>
+      </w:r>
+    </w:p>
+    <w:p>
+      <w:pPr>
+        <w:pStyle w:val="Caption"/>
+        <w:keepNext w:val="0"/>
+        <w:widowControl/>
+        <w:spacing w:after="100" w:before="0" w:line="260" w:lineRule="exact"/>
+      </w:pPr>
+      <w:r>
+        <w:rPr>
+          <w:rFonts w:ascii="Songti SC" w:hAnsi="Songti SC" w:eastAsia="Songti SC"/>
+          <w:sz w:val="17"/>
+        </w:rPr>
+        <w:t>致谢：感谢西北工业大学白任梓老师首次完成 AgentFEM 的 Windows 安装，并为本教学讲义的编制提供支持。</w:t>
       </w:r>
     </w:p>
     <w:p>
@@ -5067,7 +5082,7 @@
       </w:tabs>
     </w:pPr>
     <w:r>
-      <w:t>Haoming Luo</w:t>
+      <w:t>添加页脚</w:t>
     </w:r>
     <w:r>
       <w:tab/>

</xml_diff>

<commit_message>
Add teacher acknowledgment and editable footer placeholder (#11)
</commit_message>
<xml_diff>
--- a/public/learn/AgentFEM-first-simulations.docx
+++ b/public/learn/AgentFEM-first-simulations.docx
@@ -719,6 +719,21 @@
           <w:sz w:val="17"/>
         </w:rPr>
         <w:t>。Windows 使用 WSL2。</w:t>
+      </w:r>
+    </w:p>
+    <w:p>
+      <w:pPr>
+        <w:pStyle w:val="Caption"/>
+        <w:keepNext w:val="0"/>
+        <w:widowControl/>
+        <w:spacing w:after="100" w:before="0" w:line="260" w:lineRule="exact"/>
+      </w:pPr>
+      <w:r>
+        <w:rPr>
+          <w:rFonts w:ascii="Songti SC" w:hAnsi="Songti SC" w:eastAsia="Songti SC"/>
+          <w:sz w:val="17"/>
+        </w:rPr>
+        <w:t>致谢：感谢西北工业大学白任梓老师首次完成 AgentFEM 的 Windows 安装，并为本教学讲义的编制提供支持。</w:t>
       </w:r>
     </w:p>
     <w:p>
@@ -5067,7 +5082,7 @@
       </w:tabs>
     </w:pPr>
     <w:r>
-      <w:t>Haoming Luo</w:t>
+      <w:t>添加页脚</w:t>
     </w:r>
     <w:r>
       <w:tab/>

</xml_diff>

<commit_message>
Unify concise learning prompts across web and handouts
</commit_message>
<xml_diff>
--- a/public/learn/AgentFEM-first-simulations.docx
+++ b/public/learn/AgentFEM-first-simulations.docx
@@ -73,7 +73,7 @@
           <w:rFonts w:ascii="Songti SC" w:hAnsi="Songti SC" w:eastAsia="Songti SC"/>
           <w:sz w:val="21"/>
         </w:rPr>
-        <w:t>通过四个基本问题，学习如何向 AI 助手清楚描述有限元任务，检查建模条件，并利用理论解或数值对比判断结果是否合理。学生无需预先编写程序，但应能识别几何、材料、约束、载荷及输出量。</w:t>
+        <w:t>通过四个基本问题，学习描述有限元任务、检查建模条件，并用理论解或数值对比判断结果是否合理。无需预先编写程序，但应能识别几何、材料、约束、载荷及输出量。</w:t>
       </w:r>
     </w:p>
     <w:p>
@@ -93,30 +93,60 @@
     </w:p>
     <w:p>
       <w:pPr>
+        <w:pStyle w:val="Caption"/>
         <w:keepNext w:val="0"/>
         <w:widowControl/>
-        <w:spacing w:after="160" w:before="0" w:line="340" w:lineRule="exact"/>
+        <w:spacing w:after="100" w:before="0" w:line="260" w:lineRule="exact"/>
+      </w:pPr>
+      <w:r>
+        <w:rPr>
+          <w:rFonts w:ascii="Songti SC" w:hAnsi="Songti SC" w:eastAsia="Songti SC"/>
+          <w:sz w:val="17"/>
+        </w:rPr>
+        <w:t>使用已接入本地 AgentFEM 的 AI 助手。先发送环境检查提示词：</w:t>
+      </w:r>
+    </w:p>
+    <w:p>
+      <w:pPr>
+        <w:keepNext w:val="0"/>
+        <w:widowControl/>
+        <w:spacing w:after="160" w:before="100" w:line="300" w:lineRule="exact"/>
       </w:pPr>
       <w:r>
         <w:rPr>
           <w:rFonts w:ascii="Songti SC" w:hAnsi="Songti SC" w:eastAsia="Songti SC"/>
           <w:sz w:val="21"/>
         </w:rPr>
-        <w:t>使用能够调用本地 AgentFEM 的 AI 助手，并准备独立的练习文件夹。首次使用时，发送以下环境检查提示词；确认软件可运行后再开始练习。</w:t>
+        <w:t>请先检查能否调用 AgentFEM，告诉我软件版本和项目保存位置。若需安装或配置，先征求我的同意。现在只检查环境，不开始仿真。</w:t>
+      </w:r>
+    </w:p>
+    <w:p>
+      <w:pPr>
+        <w:pStyle w:val="Caption"/>
+        <w:keepNext w:val="0"/>
+        <w:widowControl/>
+        <w:spacing w:after="100" w:before="0" w:line="260" w:lineRule="exact"/>
+      </w:pPr>
+      <w:r>
+        <w:rPr>
+          <w:rFonts w:ascii="Songti SC" w:hAnsi="Songti SC" w:eastAsia="Songti SC"/>
+          <w:sz w:val="17"/>
+        </w:rPr>
+        <w:t>确认可用后，发送以下约定；等 AI 回复，再选择一道题发送。</w:t>
       </w:r>
     </w:p>
     <w:p>
       <w:pPr>
         <w:keepNext w:val="0"/>
         <w:widowControl/>
-        <w:spacing w:after="160" w:before="100" w:line="340" w:lineRule="exact"/>
+        <w:spacing w:after="160" w:before="100" w:line="300" w:lineRule="exact"/>
       </w:pPr>
       <w:r>
         <w:rPr>
           <w:rFonts w:ascii="Songti SC" w:hAnsi="Songti SC" w:eastAsia="Songti SC"/>
           <w:sz w:val="21"/>
         </w:rPr>
-        <w:t>请检查当前环境能否调用 AgentFEM 并运行计算，报告软件版本、可用工具和项目保存位置。若尚未安装或接入，请先说明需要完成的配置；安装或授权前征求我的同意。</w:t>
+        <w:t>接下来我会发送具体题目。收到后，请新建 AgentFEM 项目，检查设置并实际计算，保留模型和结果；给出结果图、关键数值及单位，注明网格和求解设置，并简要解释。缺少必要条件或无法运行时请说明。现在只回复“准备好了，请发送题目”，不要开始建模、猜测题目或提供选题。</w:t>
       </w:r>
     </w:p>
     <w:p>
@@ -138,70 +168,42 @@
       <w:pPr>
         <w:keepNext w:val="0"/>
         <w:widowControl/>
-        <w:spacing w:after="160" w:before="0" w:line="340" w:lineRule="exact"/>
+        <w:spacing w:after="100" w:before="0" w:line="300" w:lineRule="exact"/>
       </w:pPr>
       <w:r>
         <w:rPr>
           <w:rFonts w:ascii="Songti SC" w:hAnsi="Songti SC" w:eastAsia="Songti SC"/>
           <w:sz w:val="21"/>
         </w:rPr>
-        <w:t>• 阅读题目，先判断结果的方向、量级或变化趋势。</w:t>
+        <w:t>• 阅读题目，预判结果方向和量级；发送本题提示词，检查图、数值和单位。</w:t>
       </w:r>
     </w:p>
     <w:p>
       <w:pPr>
         <w:keepNext w:val="0"/>
         <w:widowControl/>
-        <w:spacing w:after="160" w:before="0" w:line="340" w:lineRule="exact"/>
+        <w:spacing w:after="100" w:before="0" w:line="300" w:lineRule="exact"/>
       </w:pPr>
       <w:r>
         <w:rPr>
           <w:rFonts w:ascii="Songti SC" w:hAnsi="Songti SC" w:eastAsia="Songti SC"/>
           <w:sz w:val="21"/>
         </w:rPr>
-        <w:t>• 复制本题提示词，请 AI 建立项目并实际运行。</w:t>
+        <w:t>• 完成参数对比或步长检查，填写实验记录，独立解释结果。</w:t>
       </w:r>
     </w:p>
     <w:p>
       <w:pPr>
         <w:keepNext w:val="0"/>
         <w:widowControl/>
-        <w:spacing w:after="160" w:before="0" w:line="340" w:lineRule="exact"/>
+        <w:spacing w:after="100" w:before="0" w:line="300" w:lineRule="exact"/>
       </w:pPr>
       <w:r>
         <w:rPr>
           <w:rFonts w:ascii="Songti SC" w:hAnsi="Songti SC" w:eastAsia="Songti SC"/>
           <w:sz w:val="21"/>
         </w:rPr>
-        <w:t>• 查看图、数值与单位，记录所用网格和求解设置。</w:t>
-      </w:r>
-    </w:p>
-    <w:p>
-      <w:pPr>
-        <w:keepNext w:val="0"/>
-        <w:widowControl/>
-        <w:spacing w:after="160" w:before="0" w:line="340" w:lineRule="exact"/>
-      </w:pPr>
-      <w:r>
-        <w:rPr>
-          <w:rFonts w:ascii="Songti SC" w:hAnsi="Songti SC" w:eastAsia="Songti SC"/>
-          <w:sz w:val="21"/>
-        </w:rPr>
-        <w:t>• 完成参数对比或步长检查，再独立作出解释。</w:t>
-      </w:r>
-    </w:p>
-    <w:p>
-      <w:pPr>
-        <w:keepNext w:val="0"/>
-        <w:widowControl/>
-        <w:spacing w:after="160" w:before="0" w:line="340" w:lineRule="exact"/>
-      </w:pPr>
-      <w:r>
-        <w:rPr>
-          <w:rFonts w:ascii="Songti SC" w:hAnsi="Songti SC" w:eastAsia="Songti SC"/>
-          <w:sz w:val="21"/>
-        </w:rPr>
-        <w:t>• 完成记录后，阅读第 6—7 页参考解答；差异较大时先核对条件，再加密网格或减小步长。</w:t>
+        <w:t>• 最后核对第 6—7 页参考解答；差异较大时先检查条件，再加密网格或减小步长。</w:t>
       </w:r>
     </w:p>
     <w:p>
@@ -1088,7 +1090,7 @@
           <w:rFonts w:ascii="Songti SC" w:hAnsi="Songti SC" w:eastAsia="Songti SC"/>
           <w:sz w:val="21"/>
         </w:rPr>
-        <w:t>使用 AgentFEM 计算钢悬臂梁的静力变形。梁长 200 mm、高 20 mm、厚 10 mm，弹性模量 210 GPa、泊松比 0.30。采用二维平面应力、小变形线弹性模型，忽略重力。左端两个位移分量均固定，右端施加均匀向下的总力 200 N；请按厚度换算面力，不要将总力直接作为面力。输出右端中点的竖向位移（mm）、位移云图和变形图，注明变形放大倍数。 请建立独立的 AgentFEM 项目并实际运行，保留建模文件、计算结果和关键数值表，报告采用的网格与求解设置。若无法运行，请说明原因，不要用估算值替代计算结果。</w:t>
+        <w:t>请用 AgentFEM 算一根钢悬臂梁：长 200 mm、高 20 mm、厚 10 mm，弹性模量 210 GPa、泊松比 0.3。左端固定，右端面均布向下的总力 200 N。采用二维平面应力、小变形线弹性，忽略重力。给我变形图和右端中点下沉量（mm），图上注明变形放大倍数。</w:t>
       </w:r>
     </w:p>
     <w:p>
@@ -1174,7 +1176,7 @@
           <w:rFonts w:ascii="Songti SC" w:hAnsi="Songti SC" w:eastAsia="Songti SC"/>
           <w:sz w:val="21"/>
         </w:rPr>
-        <w:t>保留原模型，将总力改为 400 N 再计算。列出两次端部下沉量及其比值，并用梁理论解释结果。</w:t>
+        <w:t>把总力改成 400 N，其他不变，再算一次。比较两次端部下沉量及其比值，用梁理论解释结果。</w:t>
       </w:r>
     </w:p>
     <w:p>
@@ -1589,7 +1591,7 @@
           <w:rFonts w:ascii="Songti SC" w:hAnsi="Songti SC" w:eastAsia="Songti SC"/>
           <w:sz w:val="21"/>
         </w:rPr>
-        <w:t>使用 AgentFEM 计算厚壁圆筒的内压响应。内半径 25 mm、外半径 50 mm，取轴向长度 100 mm，弹性模量 210 GPa、泊松比 0.30。采用线弹性轴对称模型，全域轴向位移设为零，以表示轴向平面应变。内壁承受 10 MPa 压力，外壁径向自由，不添加封头载荷。输出内壁径向位移（μm），以及轴向中部从内壁到外壁的径向位移曲线；用相同假设下的拉梅解核对。 请建立独立的 AgentFEM 项目并实际运行，保留建模文件、计算结果和关键数值表，报告采用的网格与求解设置。若无法运行，请说明原因，不要用估算值替代计算结果。</w:t>
+        <w:t>请用 AgentFEM 算一个厚壁圆筒：内半径 25 mm、外半径 50 mm、长 100 mm，弹性模量 210 GPa、泊松比 0.3。内压 10 MPa，外壁径向自由，不加封头载荷。采用线弹性轴对称模型，全域轴向位移为零。给我内壁径向位移（μm）和轴向中部沿壁厚的位移曲线，用拉梅解核对。</w:t>
       </w:r>
     </w:p>
     <w:p>
@@ -1675,7 +1677,7 @@
           <w:rFonts w:ascii="Songti SC" w:hAnsi="Songti SC" w:eastAsia="Songti SC"/>
           <w:sz w:val="21"/>
         </w:rPr>
-        <w:t>保留基准结果，将外半径改为 60 mm 后重新计算。比较两种厚度的内壁径向位移，并与拉梅解核对。</w:t>
+        <w:t>把外半径改成 60 mm，其他不变，再算一次。比较两次内壁径向位移，用拉梅解核对，说明加厚筒壁的影响。</w:t>
       </w:r>
     </w:p>
     <w:p>
@@ -2036,7 +2038,7 @@
           <w:rFonts w:ascii="Songti SC" w:hAnsi="Songti SC" w:eastAsia="Songti SC"/>
           <w:sz w:val="21"/>
         </w:rPr>
-        <w:t>使用 AgentFEM 计算二维矩形板的稳态导热。板长 100 mm、高 40 mm，导热系数为常数 45 W/(m·K)。左边保持 100 ℃，右边保持 20 ℃，其余边界绝热，无内部热源。输出温度云图、中心点温度（℃）、沿水平中线的温度曲线，以及沿长度方向的热流密度（W/m²）。规定 x 从左向右，不计算流动和热应力。 请建立独立的 AgentFEM 项目并实际运行，保留建模文件、计算结果和关键数值表，报告采用的网格与求解设置。若无法运行，请说明原因，不要用估算值替代计算结果。</w:t>
+        <w:t>请用 AgentFEM 做二维稳态导热：金属板长 100 mm、高 40 mm，均匀导热系数 45 W/(m·K)。左边保持 100 ℃，右边保持 20 ℃，其余边界绝热，没有内部热源。给我温度云图、中心温度（℃）、水平中线温度曲线和向右的热流密度（W/m²）。</w:t>
       </w:r>
     </w:p>
     <w:p>
@@ -2122,7 +2124,7 @@
           <w:rFonts w:ascii="Songti SC" w:hAnsi="Songti SC" w:eastAsia="Songti SC"/>
           <w:sz w:val="21"/>
         </w:rPr>
-        <w:t>把导热系数改为 90 W/(m·K)，其余条件不变，重新计算。将两次中心温度和热流密度列表比较，解释二者为什么不一定同时改变。</w:t>
+        <w:t>把导热系数改成 90 W/(m·K)，其他不变，再算一次。比较温度分布和热流密度，用傅里叶定律解释结果。</w:t>
       </w:r>
     </w:p>
     <w:p>
@@ -2591,7 +2593,7 @@
           <w:rFonts w:ascii="Songti SC" w:hAnsi="Songti SC" w:eastAsia="Songti SC"/>
           <w:sz w:val="21"/>
         </w:rPr>
-        <w:t>使用 AgentFEM 计算二维矩形板的瞬态升温。板长 100 mm、高 40 mm，初温 20 ℃；导热系数 45 W/(m·K)、密度 7800 kg/m³、比热 500 J/(kg·K)，材料参数不随温度变化。从 0 秒之后左边保持 100 ℃、右边保持 20 ℃，其余边界绝热，无内部热源。采用隐式 Euler，时间步长 2 秒，计算至 600 秒。输出中心温度时间曲线和 CSV 表，每 10 秒保存一帧 ParaView 可读温度场；温度图和表统一用 ℃，同时保留原始计算结果。 请建立独立的 AgentFEM 项目并实际运行，保留建模文件、计算结果和关键数值表，报告采用的网格与求解设置。若无法运行，请说明原因，不要用估算值替代计算结果。</w:t>
+        <w:t>请用 AgentFEM 算二维金属板升温：长 100 mm、高 40 mm，初温 20 ℃。导热系数 45 W/(m·K)、密度 7800 kg/m³、比热 500 J/(kg·K)，均保持常数。开始加热后左边保持 100 ℃、右边保持 20 ℃，其余边界绝热，无内部热源。用隐式 Euler、2 秒步长算到 600 秒。给我中心温度曲线及数据表（℃），每 10 秒保存一帧 ParaView 可播放的温度场。</w:t>
       </w:r>
     </w:p>
     <w:p>
@@ -2677,7 +2679,7 @@
           <w:rFonts w:ascii="Songti SC" w:hAnsi="Songti SC" w:eastAsia="Songti SC"/>
           <w:sz w:val="21"/>
         </w:rPr>
-        <w:t>将时间步长改为 1 秒，网格与其他条件不变。叠加两条中心温度曲线，报告共同采样时刻的最大温度差及 600 秒温度差；说明结果对时间步长是否敏感。</w:t>
+        <w:t>将时间步长减到 1 秒，网格和其他条件不变，再算一次。叠加两条中心温度曲线，比较共同采样时刻的最大温差和 600 秒时的温差，判断原步长是否足够。</w:t>
       </w:r>
     </w:p>
     <w:p>

</xml_diff>

<commit_message>
Unify concise learning prompts across web and handouts (#13)
</commit_message>
<xml_diff>
--- a/public/learn/AgentFEM-first-simulations.docx
+++ b/public/learn/AgentFEM-first-simulations.docx
@@ -73,7 +73,7 @@
           <w:rFonts w:ascii="Songti SC" w:hAnsi="Songti SC" w:eastAsia="Songti SC"/>
           <w:sz w:val="21"/>
         </w:rPr>
-        <w:t>通过四个基本问题，学习如何向 AI 助手清楚描述有限元任务，检查建模条件，并利用理论解或数值对比判断结果是否合理。学生无需预先编写程序，但应能识别几何、材料、约束、载荷及输出量。</w:t>
+        <w:t>通过四个基本问题，学习描述有限元任务、检查建模条件，并用理论解或数值对比判断结果是否合理。无需预先编写程序，但应能识别几何、材料、约束、载荷及输出量。</w:t>
       </w:r>
     </w:p>
     <w:p>
@@ -93,30 +93,60 @@
     </w:p>
     <w:p>
       <w:pPr>
+        <w:pStyle w:val="Caption"/>
         <w:keepNext w:val="0"/>
         <w:widowControl/>
-        <w:spacing w:after="160" w:before="0" w:line="340" w:lineRule="exact"/>
+        <w:spacing w:after="100" w:before="0" w:line="260" w:lineRule="exact"/>
+      </w:pPr>
+      <w:r>
+        <w:rPr>
+          <w:rFonts w:ascii="Songti SC" w:hAnsi="Songti SC" w:eastAsia="Songti SC"/>
+          <w:sz w:val="17"/>
+        </w:rPr>
+        <w:t>使用已接入本地 AgentFEM 的 AI 助手。先发送环境检查提示词：</w:t>
+      </w:r>
+    </w:p>
+    <w:p>
+      <w:pPr>
+        <w:keepNext w:val="0"/>
+        <w:widowControl/>
+        <w:spacing w:after="160" w:before="100" w:line="300" w:lineRule="exact"/>
       </w:pPr>
       <w:r>
         <w:rPr>
           <w:rFonts w:ascii="Songti SC" w:hAnsi="Songti SC" w:eastAsia="Songti SC"/>
           <w:sz w:val="21"/>
         </w:rPr>
-        <w:t>使用能够调用本地 AgentFEM 的 AI 助手，并准备独立的练习文件夹。首次使用时，发送以下环境检查提示词；确认软件可运行后再开始练习。</w:t>
+        <w:t>请先检查能否调用 AgentFEM，告诉我软件版本和项目保存位置。若需安装或配置，先征求我的同意。现在只检查环境，不开始仿真。</w:t>
+      </w:r>
+    </w:p>
+    <w:p>
+      <w:pPr>
+        <w:pStyle w:val="Caption"/>
+        <w:keepNext w:val="0"/>
+        <w:widowControl/>
+        <w:spacing w:after="100" w:before="0" w:line="260" w:lineRule="exact"/>
+      </w:pPr>
+      <w:r>
+        <w:rPr>
+          <w:rFonts w:ascii="Songti SC" w:hAnsi="Songti SC" w:eastAsia="Songti SC"/>
+          <w:sz w:val="17"/>
+        </w:rPr>
+        <w:t>确认可用后，发送以下约定；等 AI 回复，再选择一道题发送。</w:t>
       </w:r>
     </w:p>
     <w:p>
       <w:pPr>
         <w:keepNext w:val="0"/>
         <w:widowControl/>
-        <w:spacing w:after="160" w:before="100" w:line="340" w:lineRule="exact"/>
+        <w:spacing w:after="160" w:before="100" w:line="300" w:lineRule="exact"/>
       </w:pPr>
       <w:r>
         <w:rPr>
           <w:rFonts w:ascii="Songti SC" w:hAnsi="Songti SC" w:eastAsia="Songti SC"/>
           <w:sz w:val="21"/>
         </w:rPr>
-        <w:t>请检查当前环境能否调用 AgentFEM 并运行计算，报告软件版本、可用工具和项目保存位置。若尚未安装或接入，请先说明需要完成的配置；安装或授权前征求我的同意。</w:t>
+        <w:t>接下来我会发送具体题目。收到后，请新建 AgentFEM 项目，检查设置并实际计算，保留模型和结果；给出结果图、关键数值及单位，注明网格和求解设置，并简要解释。缺少必要条件或无法运行时请说明。现在只回复“准备好了，请发送题目”，不要开始建模、猜测题目或提供选题。</w:t>
       </w:r>
     </w:p>
     <w:p>
@@ -138,70 +168,42 @@
       <w:pPr>
         <w:keepNext w:val="0"/>
         <w:widowControl/>
-        <w:spacing w:after="160" w:before="0" w:line="340" w:lineRule="exact"/>
+        <w:spacing w:after="100" w:before="0" w:line="300" w:lineRule="exact"/>
       </w:pPr>
       <w:r>
         <w:rPr>
           <w:rFonts w:ascii="Songti SC" w:hAnsi="Songti SC" w:eastAsia="Songti SC"/>
           <w:sz w:val="21"/>
         </w:rPr>
-        <w:t>• 阅读题目，先判断结果的方向、量级或变化趋势。</w:t>
+        <w:t>• 阅读题目，预判结果方向和量级；发送本题提示词，检查图、数值和单位。</w:t>
       </w:r>
     </w:p>
     <w:p>
       <w:pPr>
         <w:keepNext w:val="0"/>
         <w:widowControl/>
-        <w:spacing w:after="160" w:before="0" w:line="340" w:lineRule="exact"/>
+        <w:spacing w:after="100" w:before="0" w:line="300" w:lineRule="exact"/>
       </w:pPr>
       <w:r>
         <w:rPr>
           <w:rFonts w:ascii="Songti SC" w:hAnsi="Songti SC" w:eastAsia="Songti SC"/>
           <w:sz w:val="21"/>
         </w:rPr>
-        <w:t>• 复制本题提示词，请 AI 建立项目并实际运行。</w:t>
+        <w:t>• 完成参数对比或步长检查，填写实验记录，独立解释结果。</w:t>
       </w:r>
     </w:p>
     <w:p>
       <w:pPr>
         <w:keepNext w:val="0"/>
         <w:widowControl/>
-        <w:spacing w:after="160" w:before="0" w:line="340" w:lineRule="exact"/>
+        <w:spacing w:after="100" w:before="0" w:line="300" w:lineRule="exact"/>
       </w:pPr>
       <w:r>
         <w:rPr>
           <w:rFonts w:ascii="Songti SC" w:hAnsi="Songti SC" w:eastAsia="Songti SC"/>
           <w:sz w:val="21"/>
         </w:rPr>
-        <w:t>• 查看图、数值与单位，记录所用网格和求解设置。</w:t>
-      </w:r>
-    </w:p>
-    <w:p>
-      <w:pPr>
-        <w:keepNext w:val="0"/>
-        <w:widowControl/>
-        <w:spacing w:after="160" w:before="0" w:line="340" w:lineRule="exact"/>
-      </w:pPr>
-      <w:r>
-        <w:rPr>
-          <w:rFonts w:ascii="Songti SC" w:hAnsi="Songti SC" w:eastAsia="Songti SC"/>
-          <w:sz w:val="21"/>
-        </w:rPr>
-        <w:t>• 完成参数对比或步长检查，再独立作出解释。</w:t>
-      </w:r>
-    </w:p>
-    <w:p>
-      <w:pPr>
-        <w:keepNext w:val="0"/>
-        <w:widowControl/>
-        <w:spacing w:after="160" w:before="0" w:line="340" w:lineRule="exact"/>
-      </w:pPr>
-      <w:r>
-        <w:rPr>
-          <w:rFonts w:ascii="Songti SC" w:hAnsi="Songti SC" w:eastAsia="Songti SC"/>
-          <w:sz w:val="21"/>
-        </w:rPr>
-        <w:t>• 完成记录后，阅读第 6—7 页参考解答；差异较大时先核对条件，再加密网格或减小步长。</w:t>
+        <w:t>• 最后核对第 6—7 页参考解答；差异较大时先检查条件，再加密网格或减小步长。</w:t>
       </w:r>
     </w:p>
     <w:p>
@@ -1088,7 +1090,7 @@
           <w:rFonts w:ascii="Songti SC" w:hAnsi="Songti SC" w:eastAsia="Songti SC"/>
           <w:sz w:val="21"/>
         </w:rPr>
-        <w:t>使用 AgentFEM 计算钢悬臂梁的静力变形。梁长 200 mm、高 20 mm、厚 10 mm，弹性模量 210 GPa、泊松比 0.30。采用二维平面应力、小变形线弹性模型，忽略重力。左端两个位移分量均固定，右端施加均匀向下的总力 200 N；请按厚度换算面力，不要将总力直接作为面力。输出右端中点的竖向位移（mm）、位移云图和变形图，注明变形放大倍数。 请建立独立的 AgentFEM 项目并实际运行，保留建模文件、计算结果和关键数值表，报告采用的网格与求解设置。若无法运行，请说明原因，不要用估算值替代计算结果。</w:t>
+        <w:t>请用 AgentFEM 算一根钢悬臂梁：长 200 mm、高 20 mm、厚 10 mm，弹性模量 210 GPa、泊松比 0.3。左端固定，右端面均布向下的总力 200 N。采用二维平面应力、小变形线弹性，忽略重力。给我变形图和右端中点下沉量（mm），图上注明变形放大倍数。</w:t>
       </w:r>
     </w:p>
     <w:p>
@@ -1174,7 +1176,7 @@
           <w:rFonts w:ascii="Songti SC" w:hAnsi="Songti SC" w:eastAsia="Songti SC"/>
           <w:sz w:val="21"/>
         </w:rPr>
-        <w:t>保留原模型，将总力改为 400 N 再计算。列出两次端部下沉量及其比值，并用梁理论解释结果。</w:t>
+        <w:t>把总力改成 400 N，其他不变，再算一次。比较两次端部下沉量及其比值，用梁理论解释结果。</w:t>
       </w:r>
     </w:p>
     <w:p>
@@ -1589,7 +1591,7 @@
           <w:rFonts w:ascii="Songti SC" w:hAnsi="Songti SC" w:eastAsia="Songti SC"/>
           <w:sz w:val="21"/>
         </w:rPr>
-        <w:t>使用 AgentFEM 计算厚壁圆筒的内压响应。内半径 25 mm、外半径 50 mm，取轴向长度 100 mm，弹性模量 210 GPa、泊松比 0.30。采用线弹性轴对称模型，全域轴向位移设为零，以表示轴向平面应变。内壁承受 10 MPa 压力，外壁径向自由，不添加封头载荷。输出内壁径向位移（μm），以及轴向中部从内壁到外壁的径向位移曲线；用相同假设下的拉梅解核对。 请建立独立的 AgentFEM 项目并实际运行，保留建模文件、计算结果和关键数值表，报告采用的网格与求解设置。若无法运行，请说明原因，不要用估算值替代计算结果。</w:t>
+        <w:t>请用 AgentFEM 算一个厚壁圆筒：内半径 25 mm、外半径 50 mm、长 100 mm，弹性模量 210 GPa、泊松比 0.3。内压 10 MPa，外壁径向自由，不加封头载荷。采用线弹性轴对称模型，全域轴向位移为零。给我内壁径向位移（μm）和轴向中部沿壁厚的位移曲线，用拉梅解核对。</w:t>
       </w:r>
     </w:p>
     <w:p>
@@ -1675,7 +1677,7 @@
           <w:rFonts w:ascii="Songti SC" w:hAnsi="Songti SC" w:eastAsia="Songti SC"/>
           <w:sz w:val="21"/>
         </w:rPr>
-        <w:t>保留基准结果，将外半径改为 60 mm 后重新计算。比较两种厚度的内壁径向位移，并与拉梅解核对。</w:t>
+        <w:t>把外半径改成 60 mm，其他不变，再算一次。比较两次内壁径向位移，用拉梅解核对，说明加厚筒壁的影响。</w:t>
       </w:r>
     </w:p>
     <w:p>
@@ -2036,7 +2038,7 @@
           <w:rFonts w:ascii="Songti SC" w:hAnsi="Songti SC" w:eastAsia="Songti SC"/>
           <w:sz w:val="21"/>
         </w:rPr>
-        <w:t>使用 AgentFEM 计算二维矩形板的稳态导热。板长 100 mm、高 40 mm，导热系数为常数 45 W/(m·K)。左边保持 100 ℃，右边保持 20 ℃，其余边界绝热，无内部热源。输出温度云图、中心点温度（℃）、沿水平中线的温度曲线，以及沿长度方向的热流密度（W/m²）。规定 x 从左向右，不计算流动和热应力。 请建立独立的 AgentFEM 项目并实际运行，保留建模文件、计算结果和关键数值表，报告采用的网格与求解设置。若无法运行，请说明原因，不要用估算值替代计算结果。</w:t>
+        <w:t>请用 AgentFEM 做二维稳态导热：金属板长 100 mm、高 40 mm，均匀导热系数 45 W/(m·K)。左边保持 100 ℃，右边保持 20 ℃，其余边界绝热，没有内部热源。给我温度云图、中心温度（℃）、水平中线温度曲线和向右的热流密度（W/m²）。</w:t>
       </w:r>
     </w:p>
     <w:p>
@@ -2122,7 +2124,7 @@
           <w:rFonts w:ascii="Songti SC" w:hAnsi="Songti SC" w:eastAsia="Songti SC"/>
           <w:sz w:val="21"/>
         </w:rPr>
-        <w:t>把导热系数改为 90 W/(m·K)，其余条件不变，重新计算。将两次中心温度和热流密度列表比较，解释二者为什么不一定同时改变。</w:t>
+        <w:t>把导热系数改成 90 W/(m·K)，其他不变，再算一次。比较温度分布和热流密度，用傅里叶定律解释结果。</w:t>
       </w:r>
     </w:p>
     <w:p>
@@ -2591,7 +2593,7 @@
           <w:rFonts w:ascii="Songti SC" w:hAnsi="Songti SC" w:eastAsia="Songti SC"/>
           <w:sz w:val="21"/>
         </w:rPr>
-        <w:t>使用 AgentFEM 计算二维矩形板的瞬态升温。板长 100 mm、高 40 mm，初温 20 ℃；导热系数 45 W/(m·K)、密度 7800 kg/m³、比热 500 J/(kg·K)，材料参数不随温度变化。从 0 秒之后左边保持 100 ℃、右边保持 20 ℃，其余边界绝热，无内部热源。采用隐式 Euler，时间步长 2 秒，计算至 600 秒。输出中心温度时间曲线和 CSV 表，每 10 秒保存一帧 ParaView 可读温度场；温度图和表统一用 ℃，同时保留原始计算结果。 请建立独立的 AgentFEM 项目并实际运行，保留建模文件、计算结果和关键数值表，报告采用的网格与求解设置。若无法运行，请说明原因，不要用估算值替代计算结果。</w:t>
+        <w:t>请用 AgentFEM 算二维金属板升温：长 100 mm、高 40 mm，初温 20 ℃。导热系数 45 W/(m·K)、密度 7800 kg/m³、比热 500 J/(kg·K)，均保持常数。开始加热后左边保持 100 ℃、右边保持 20 ℃，其余边界绝热，无内部热源。用隐式 Euler、2 秒步长算到 600 秒。给我中心温度曲线及数据表（℃），每 10 秒保存一帧 ParaView 可播放的温度场。</w:t>
       </w:r>
     </w:p>
     <w:p>
@@ -2677,7 +2679,7 @@
           <w:rFonts w:ascii="Songti SC" w:hAnsi="Songti SC" w:eastAsia="Songti SC"/>
           <w:sz w:val="21"/>
         </w:rPr>
-        <w:t>将时间步长改为 1 秒，网格与其他条件不变。叠加两条中心温度曲线，报告共同采样时刻的最大温度差及 600 秒温度差；说明结果对时间步长是否敏感。</w:t>
+        <w:t>将时间步长减到 1 秒，网格和其他条件不变，再算一次。叠加两条中心温度曲线，比较共同采样时刻的最大温差和 600 秒时的温差，判断原步长是否足够。</w:t>
       </w:r>
     </w:p>
     <w:p>

</xml_diff>

<commit_message>
Remove assistant connection reference from handout setup
</commit_message>
<xml_diff>
--- a/public/learn/AgentFEM-first-simulations.docx
+++ b/public/learn/AgentFEM-first-simulations.docx
@@ -871,21 +871,6 @@
           <w:rFonts w:ascii="Songti SC" w:hAnsi="Songti SC" w:eastAsia="Songti SC"/>
           <w:sz w:val="17"/>
         </w:rPr>
-        <w:t>；</w:t>
-      </w:r>
-      <w:hyperlink r:id="rId12">
-        <w:r>
-          <w:rPr>
-            <w:color w:val="336B85"/>
-          </w:rPr>
-          <w:t>AI 助手连接说明</w:t>
-        </w:r>
-      </w:hyperlink>
-      <w:r>
-        <w:rPr>
-          <w:rFonts w:ascii="Songti SC" w:hAnsi="Songti SC" w:eastAsia="Songti SC"/>
-          <w:sz w:val="17"/>
-        </w:rPr>
         <w:t>。Windows 使用 WSL2。</w:t>
       </w:r>
     </w:p>
@@ -945,7 +930,7 @@
                     <pic:cNvPicPr/>
                   </pic:nvPicPr>
                   <pic:blipFill>
-                    <a:blip r:embed="rId13"/>
+                    <a:blip r:embed="rId12"/>
                     <a:stretch>
                       <a:fillRect/>
                     </a:stretch>
@@ -1446,7 +1431,7 @@
                     <pic:cNvPicPr/>
                   </pic:nvPicPr>
                   <pic:blipFill>
-                    <a:blip r:embed="rId14"/>
+                    <a:blip r:embed="rId13"/>
                     <a:stretch>
                       <a:fillRect/>
                     </a:stretch>
@@ -1947,7 +1932,7 @@
                     <pic:cNvPicPr/>
                   </pic:nvPicPr>
                   <pic:blipFill>
-                    <a:blip r:embed="rId15"/>
+                    <a:blip r:embed="rId14"/>
                     <a:stretch>
                       <a:fillRect/>
                     </a:stretch>
@@ -2394,7 +2379,7 @@
                     <pic:cNvPicPr/>
                   </pic:nvPicPr>
                   <pic:blipFill>
-                    <a:blip r:embed="rId16"/>
+                    <a:blip r:embed="rId15"/>
                     <a:stretch>
                       <a:fillRect/>
                     </a:stretch>
@@ -2964,7 +2949,7 @@
                     <pic:cNvPicPr/>
                   </pic:nvPicPr>
                   <pic:blipFill>
-                    <a:blip r:embed="rId17"/>
+                    <a:blip r:embed="rId16"/>
                     <a:stretch>
                       <a:fillRect/>
                     </a:stretch>
@@ -3172,7 +3157,7 @@
                     <pic:cNvPicPr/>
                   </pic:nvPicPr>
                   <pic:blipFill>
-                    <a:blip r:embed="rId18"/>
+                    <a:blip r:embed="rId17"/>
                     <a:stretch>
                       <a:fillRect/>
                     </a:stretch>
@@ -3213,7 +3198,7 @@
         <w:widowControl/>
         <w:spacing w:after="60" w:before="0" w:line="220" w:lineRule="exact"/>
       </w:pPr>
-      <w:hyperlink r:id="rId19">
+      <w:hyperlink r:id="rId18">
         <w:r>
           <w:rPr>
             <w:color w:val="336B85"/>
@@ -3775,7 +3760,7 @@
                     <pic:cNvPicPr/>
                   </pic:nvPicPr>
                   <pic:blipFill>
-                    <a:blip r:embed="rId20"/>
+                    <a:blip r:embed="rId19"/>
                     <a:stretch>
                       <a:fillRect/>
                     </a:stretch>
@@ -4298,7 +4283,7 @@
                     <pic:cNvPicPr/>
                   </pic:nvPicPr>
                   <pic:blipFill>
-                    <a:blip r:embed="rId21"/>
+                    <a:blip r:embed="rId20"/>
                     <a:stretch>
                       <a:fillRect/>
                     </a:stretch>
@@ -4722,7 +4707,7 @@
                     <pic:cNvPicPr/>
                   </pic:nvPicPr>
                   <pic:blipFill>
-                    <a:blip r:embed="rId22"/>
+                    <a:blip r:embed="rId21"/>
                     <a:stretch>
                       <a:fillRect/>
                     </a:stretch>
@@ -5497,7 +5482,7 @@
                     <pic:cNvPicPr/>
                   </pic:nvPicPr>
                   <pic:blipFill>
-                    <a:blip r:embed="rId23"/>
+                    <a:blip r:embed="rId22"/>
                     <a:stretch>
                       <a:fillRect/>
                     </a:stretch>
@@ -5940,7 +5925,7 @@
                     <pic:cNvPicPr/>
                   </pic:nvPicPr>
                   <pic:blipFill>
-                    <a:blip r:embed="rId24"/>
+                    <a:blip r:embed="rId23"/>
                     <a:stretch>
                       <a:fillRect/>
                     </a:stretch>
@@ -6428,7 +6413,7 @@
                     <pic:cNvPicPr/>
                   </pic:nvPicPr>
                   <pic:blipFill>
-                    <a:blip r:embed="rId25"/>
+                    <a:blip r:embed="rId24"/>
                     <a:stretch>
                       <a:fillRect/>
                     </a:stretch>
@@ -6491,7 +6476,7 @@
         </w:rPr>
         <w:t xml:space="preserve">[1] 本讲义网页互动版：可复制提示词、查看结果图与操作说明。 </w:t>
       </w:r>
-      <w:hyperlink r:id="rId26">
+      <w:hyperlink r:id="rId25">
         <w:r>
           <w:rPr>
             <w:color w:val="336B85"/>

</xml_diff>

<commit_message>
Remove assistant connection reference from handout setup (#25)
</commit_message>
<xml_diff>
--- a/public/learn/AgentFEM-first-simulations.docx
+++ b/public/learn/AgentFEM-first-simulations.docx
@@ -871,21 +871,6 @@
           <w:rFonts w:ascii="Songti SC" w:hAnsi="Songti SC" w:eastAsia="Songti SC"/>
           <w:sz w:val="17"/>
         </w:rPr>
-        <w:t>；</w:t>
-      </w:r>
-      <w:hyperlink r:id="rId12">
-        <w:r>
-          <w:rPr>
-            <w:color w:val="336B85"/>
-          </w:rPr>
-          <w:t>AI 助手连接说明</w:t>
-        </w:r>
-      </w:hyperlink>
-      <w:r>
-        <w:rPr>
-          <w:rFonts w:ascii="Songti SC" w:hAnsi="Songti SC" w:eastAsia="Songti SC"/>
-          <w:sz w:val="17"/>
-        </w:rPr>
         <w:t>。Windows 使用 WSL2。</w:t>
       </w:r>
     </w:p>
@@ -945,7 +930,7 @@
                     <pic:cNvPicPr/>
                   </pic:nvPicPr>
                   <pic:blipFill>
-                    <a:blip r:embed="rId13"/>
+                    <a:blip r:embed="rId12"/>
                     <a:stretch>
                       <a:fillRect/>
                     </a:stretch>
@@ -1446,7 +1431,7 @@
                     <pic:cNvPicPr/>
                   </pic:nvPicPr>
                   <pic:blipFill>
-                    <a:blip r:embed="rId14"/>
+                    <a:blip r:embed="rId13"/>
                     <a:stretch>
                       <a:fillRect/>
                     </a:stretch>
@@ -1947,7 +1932,7 @@
                     <pic:cNvPicPr/>
                   </pic:nvPicPr>
                   <pic:blipFill>
-                    <a:blip r:embed="rId15"/>
+                    <a:blip r:embed="rId14"/>
                     <a:stretch>
                       <a:fillRect/>
                     </a:stretch>
@@ -2394,7 +2379,7 @@
                     <pic:cNvPicPr/>
                   </pic:nvPicPr>
                   <pic:blipFill>
-                    <a:blip r:embed="rId16"/>
+                    <a:blip r:embed="rId15"/>
                     <a:stretch>
                       <a:fillRect/>
                     </a:stretch>
@@ -2964,7 +2949,7 @@
                     <pic:cNvPicPr/>
                   </pic:nvPicPr>
                   <pic:blipFill>
-                    <a:blip r:embed="rId17"/>
+                    <a:blip r:embed="rId16"/>
                     <a:stretch>
                       <a:fillRect/>
                     </a:stretch>
@@ -3172,7 +3157,7 @@
                     <pic:cNvPicPr/>
                   </pic:nvPicPr>
                   <pic:blipFill>
-                    <a:blip r:embed="rId18"/>
+                    <a:blip r:embed="rId17"/>
                     <a:stretch>
                       <a:fillRect/>
                     </a:stretch>
@@ -3213,7 +3198,7 @@
         <w:widowControl/>
         <w:spacing w:after="60" w:before="0" w:line="220" w:lineRule="exact"/>
       </w:pPr>
-      <w:hyperlink r:id="rId19">
+      <w:hyperlink r:id="rId18">
         <w:r>
           <w:rPr>
             <w:color w:val="336B85"/>
@@ -3775,7 +3760,7 @@
                     <pic:cNvPicPr/>
                   </pic:nvPicPr>
                   <pic:blipFill>
-                    <a:blip r:embed="rId20"/>
+                    <a:blip r:embed="rId19"/>
                     <a:stretch>
                       <a:fillRect/>
                     </a:stretch>
@@ -4298,7 +4283,7 @@
                     <pic:cNvPicPr/>
                   </pic:nvPicPr>
                   <pic:blipFill>
-                    <a:blip r:embed="rId21"/>
+                    <a:blip r:embed="rId20"/>
                     <a:stretch>
                       <a:fillRect/>
                     </a:stretch>
@@ -4722,7 +4707,7 @@
                     <pic:cNvPicPr/>
                   </pic:nvPicPr>
                   <pic:blipFill>
-                    <a:blip r:embed="rId22"/>
+                    <a:blip r:embed="rId21"/>
                     <a:stretch>
                       <a:fillRect/>
                     </a:stretch>
@@ -5497,7 +5482,7 @@
                     <pic:cNvPicPr/>
                   </pic:nvPicPr>
                   <pic:blipFill>
-                    <a:blip r:embed="rId23"/>
+                    <a:blip r:embed="rId22"/>
                     <a:stretch>
                       <a:fillRect/>
                     </a:stretch>
@@ -5940,7 +5925,7 @@
                     <pic:cNvPicPr/>
                   </pic:nvPicPr>
                   <pic:blipFill>
-                    <a:blip r:embed="rId24"/>
+                    <a:blip r:embed="rId23"/>
                     <a:stretch>
                       <a:fillRect/>
                     </a:stretch>
@@ -6428,7 +6413,7 @@
                     <pic:cNvPicPr/>
                   </pic:nvPicPr>
                   <pic:blipFill>
-                    <a:blip r:embed="rId25"/>
+                    <a:blip r:embed="rId24"/>
                     <a:stretch>
                       <a:fillRect/>
                     </a:stretch>
@@ -6491,7 +6476,7 @@
         </w:rPr>
         <w:t xml:space="preserve">[1] 本讲义网页互动版：可复制提示词、查看结果图与操作说明。 </w:t>
       </w:r>
-      <w:hyperlink r:id="rId26">
+      <w:hyperlink r:id="rId25">
         <w:r>
           <w:rPr>
             <w:color w:val="336B85"/>

</xml_diff>